<commit_message>
Document completed QLoRA run and evaluation workflow
</commit_message>
<xml_diff>
--- a/docs/PI_SYNAGENT_SYNLLAMA_AND_FINETUNING_REPORT.docx
+++ b/docs/PI_SYNAGENT_SYNLLAMA_AND_FINETUNING_REPORT.docx
@@ -52,7 +52,7 @@
         <w:t xml:space="preserve">Updated: </w:t>
       </w:r>
       <w:r>
-        <w:t>August 30, 2026</w:t>
+        <w:t>August 31, 2026</w:t>
       </w:r>
     </w:p>
     <w:p>
@@ -80,7 +80,7 @@
         <w:t xml:space="preserve">Training: </w:t>
       </w:r>
       <w:r>
-        <w:t>Lawrencium job 25306635 - running at 79.6% when captured</w:t>
+        <w:t>Lawrencium job 25306635 - completed 12,090/12,090, exit 0</w:t>
       </w:r>
     </w:p>
     <w:p>
@@ -157,7 +157,7 @@
     </w:p>
     <w:p>
       <w:r>
-        <w:t xml:space="preserve">   base model cache, SLURM scripts, 50-step QLoRA smoke test, and 200-step    four-A40 full-parameter timing run have completed successfully. A separate    one-epoch 1M-row QLoRA run is actively training as job </w:t>
+        <w:t xml:space="preserve">   base model cache, SLURM scripts, 50-step QLoRA smoke test, and 200-step    four-A40 full-parameter timing run have completed successfully. A separate    one-epoch 1M-row QLoRA run completed successfully as job </w:t>
       </w:r>
       <w:r>
         <w:rPr>
@@ -1655,66 +1655,12 @@
         <w:pStyle w:val="Heading1"/>
       </w:pPr>
       <w:r>
-        <w:t>7. Real 1M-row QLoRA run</w:t>
-      </w:r>
-    </w:p>
-    <w:p>
-      <w:pPr>
-        <w:spacing w:before="120" w:after="80"/>
-        <w:jc w:val="center"/>
-      </w:pPr>
-      <w:r>
-        <w:drawing>
-          <wp:inline xmlns:a="http://schemas.openxmlformats.org/drawingml/2006/main" xmlns:pic="http://schemas.openxmlformats.org/drawingml/2006/picture">
-            <wp:extent cx="5623560" cy="2964615"/>
-            <wp:docPr id="3" name="Picture 3"/>
-            <wp:cNvGraphicFramePr>
-              <a:graphicFrameLocks noChangeAspect="1"/>
-            </wp:cNvGraphicFramePr>
-            <a:graphic>
-              <a:graphicData uri="http://schemas.openxmlformats.org/drawingml/2006/picture">
-                <pic:pic>
-                  <pic:nvPicPr>
-                    <pic:cNvPr id="0" name="fig5_finetuning_progress.png"/>
-                    <pic:cNvPicPr/>
-                  </pic:nvPicPr>
-                  <pic:blipFill>
-                    <a:blip r:embed="rId13"/>
-                    <a:stretch>
-                      <a:fillRect/>
-                    </a:stretch>
-                  </pic:blipFill>
-                  <pic:spPr>
-                    <a:xfrm>
-                      <a:off x="0" y="0"/>
-                      <a:ext cx="5623560" cy="2964615"/>
-                    </a:xfrm>
-                    <a:prstGeom prst="rect"/>
-                  </pic:spPr>
-                </pic:pic>
-              </a:graphicData>
-            </a:graphic>
-          </wp:inline>
-        </w:drawing>
-      </w:r>
-    </w:p>
-    <w:p>
-      <w:pPr>
-        <w:spacing w:after="160"/>
-        <w:jc w:val="center"/>
-      </w:pPr>
-      <w:r>
-        <w:rPr>
-          <w:i/>
-          <w:color w:val="5A6470"/>
-          <w:sz w:val="18"/>
-        </w:rPr>
-        <w:t>Figure 3. Held-out evaluation loss decreased monotonically from step 500 through step 9,500.</w:t>
+        <w:t>7. Completed 1M-row QLoRA run</w:t>
       </w:r>
     </w:p>
     <w:p>
       <w:r>
-        <w:t xml:space="preserve">The production-scale pilot is running as Lawrencium job </w:t>
+        <w:t xml:space="preserve">The production-scale pilot completed as Lawrencium job </w:t>
       </w:r>
       <w:r>
         <w:rPr>
@@ -1826,7 +1772,7 @@
         <w:pStyle w:val="Heading2"/>
       </w:pPr>
       <w:r>
-        <w:t>Verified live status at 12:31 PM PDT on August 30</w:t>
+        <w:t>Verified final status on August 31</w:t>
       </w:r>
     </w:p>
     <w:p>
@@ -1840,17 +1786,16 @@
         <w:rPr>
           <w:b/>
         </w:rPr>
-        <w:t>RUNNING</w:t>
+        <w:t>COMPLETED</w:t>
       </w:r>
       <w:r>
-        <w:t xml:space="preserve">, with all four A40 GPUs allocated on </w:t>
+        <w:t xml:space="preserve">, exit code </w:t>
       </w:r>
       <w:r>
         <w:rPr>
-          <w:rFonts w:ascii="Consolas" w:hAnsi="Consolas"/>
-          <w:sz w:val="19"/>
+          <w:b/>
         </w:rPr>
-        <w:t>n0000.es1</w:t>
+        <w:t>0:0</w:t>
       </w:r>
       <w:r>
         <w:t>;</w:t>
@@ -1867,10 +1812,10 @@
         <w:rPr>
           <w:b/>
         </w:rPr>
-        <w:t>9,622 / 12,090 steps (79.6%)</w:t>
+        <w:t>12,090 / 12,090 steps</w:t>
       </w:r>
       <w:r>
-        <w:t>, epoch 0.80;</w:t>
+        <w:t>, epoch 1.0;</w:t>
       </w:r>
     </w:p>
     <w:p>
@@ -1878,7 +1823,16 @@
         <w:pStyle w:val="ListBullet"/>
       </w:pPr>
       <w:r>
-        <w:t>elapsed training time: approximately 55 hours;</w:t>
+        <w:t xml:space="preserve">elapsed allocation time: </w:t>
+      </w:r>
+      <w:r>
+        <w:rPr>
+          <w:b/>
+        </w:rPr>
+        <w:t>2 days, 22 hours, 3 minutes, 47 seconds</w:t>
+      </w:r>
+      <w:r>
+        <w:t>;</w:t>
       </w:r>
     </w:p>
     <w:p>
@@ -1886,7 +1840,12 @@
         <w:pStyle w:val="ListBullet"/>
       </w:pPr>
       <w:r>
-        <w:t>current steady-state rate: approximately 20 seconds per optimizer step;</w:t>
+        <w:t>training runtime: 251,233 seconds, with 3.953 samples/second and 0.048</w:t>
+      </w:r>
+    </w:p>
+    <w:p>
+      <w:r>
+        <w:t xml:space="preserve">  optimizer steps/second;</w:t>
       </w:r>
     </w:p>
     <w:p>
@@ -1894,15 +1853,16 @@
         <w:pStyle w:val="ListBullet"/>
       </w:pPr>
       <w:r>
-        <w:t>estimated remaining training time: approximately 14 hours;</w:t>
+        <w:t xml:space="preserve">final reported training loss: </w:t>
       </w:r>
-    </w:p>
-    <w:p>
-      <w:pPr>
-        <w:pStyle w:val="ListBullet"/>
-      </w:pPr>
       <w:r>
-        <w:t>recent training loss: generally 0.04-0.06;</w:t>
+        <w:rPr>
+          <w:b/>
+        </w:rPr>
+        <w:t>0.06389</w:t>
+      </w:r>
+      <w:r>
+        <w:t>;</w:t>
       </w:r>
     </w:p>
     <w:p>
@@ -1921,7 +1881,7 @@
         <w:rPr>
           <w:b/>
         </w:rPr>
-        <w:t>0.05064 at step 9,500</w:t>
+        <w:t>0.04937 at step 12,000</w:t>
       </w:r>
       <w:r>
         <w:t>; and</w:t>
@@ -1932,17 +1892,37 @@
         <w:pStyle w:val="ListBullet"/>
       </w:pPr>
       <w:r>
-        <w:t>recoverable checkpoints: steps 8,500, 9,000, and 9,500, each containing a</w:t>
+        <w:t xml:space="preserve">final adapter: </w:t>
+      </w:r>
+      <w:r>
+        <w:rPr>
+          <w:rFonts w:ascii="Consolas" w:hAnsi="Consolas"/>
+          <w:sz w:val="19"/>
+        </w:rPr>
+        <w:t>adapter_model.bin</w:t>
+      </w:r>
+      <w:r>
+        <w:t>, approximately 168 MB, with checkpoints at</w:t>
       </w:r>
     </w:p>
     <w:p>
       <w:r>
-        <w:t xml:space="preserve">  roughly 168 MB adapter plus optimizer and trainer state.</w:t>
+        <w:t xml:space="preserve">  steps 11,500, 12,000, and 12,090.</w:t>
       </w:r>
     </w:p>
     <w:p>
       <w:r>
-        <w:t>Mean logged training loss decreased from 0.6006 over the first 100-step logging window to 0.0484 over the most recent 500-step window. The decreasing held-out loss is encouraging evidence that training is learning the dataset rather than merely completing steps. Final quality still requires generation-based held-out evaluation after the job finishes.</w:t>
+        <w:t xml:space="preserve">The output directory is approximately 953 MB including the three retained checkpoints. The error scan found no traceback, CUDA out-of-memory event, NCCL failure, or runtime error. The monotonic validation-loss decline is strong evidence that optimization worked, but final chemistry quality still requires a generation-based comparison with the untouched base model on data excluded before training. The branch now includes a one-A40 reproducible comparison job and a step-by-step evaluation guide in </w:t>
+      </w:r>
+      <w:r>
+        <w:rPr>
+          <w:rFonts w:ascii="Consolas" w:hAnsi="Consolas"/>
+          <w:sz w:val="19"/>
+        </w:rPr>
+        <w:t>docs/lawrencium/</w:t>
+      </w:r>
+      <w:r>
+        <w:t>.</w:t>
       </w:r>
     </w:p>
     <w:p>
@@ -2202,17 +2182,7 @@
     </w:p>
     <w:p>
       <w:r>
-        <w:t xml:space="preserve">The final QLoRA adapter, its completed SLURM accounting, and generation-based held-out evaluation should be appended after job </w:t>
-      </w:r>
-      <w:r>
-        <w:rPr>
-          <w:rFonts w:ascii="Consolas" w:hAnsi="Consolas"/>
-          <w:sz w:val="19"/>
-        </w:rPr>
-        <w:t>25306635</w:t>
-      </w:r>
-      <w:r>
-        <w:t xml:space="preserve"> reaches a terminal state.</w:t>
+        <w:t>The QLoRA adapter and completed SLURM accounting are verified. The remaining paper-critical item is generation-based evaluation on a genuinely held-out, source-stratified test set.</w:t>
       </w:r>
     </w:p>
     <w:sectPr>

</xml_diff>

<commit_message>
Add completed QLoRA generation comparison
</commit_message>
<xml_diff>
--- a/docs/PI_SYNAGENT_SYNLLAMA_AND_FINETUNING_REPORT.docx
+++ b/docs/PI_SYNAGENT_SYNLLAMA_AND_FINETUNING_REPORT.docx
@@ -1926,6 +1926,11 @@
       </w:r>
     </w:p>
     <w:p>
+      <w:r>
+        <w:t>A post-training functionality job then loaded the untouched base and QLoRA models sequentially on one A40 and completed 25/25 generations for each. On this training-file sample, normalized character similarity to the saved reference increased from 0.0508 to 0.5500. This confirms that the adapter loads and materially changes responses toward the training format; it is not a held-out chemistry-quality result.</w:t>
+      </w:r>
+    </w:p>
+    <w:p>
       <w:pPr>
         <w:pStyle w:val="Heading1"/>
       </w:pPr>

</xml_diff>